<commit_message>
Use campaign screenshots in weekly report
Co-authored-by: Sylviaaa555 <Sylviaaa555@users.noreply.github.com>
</commit_message>
<xml_diff>
--- a/Google_Ads周报_2026-08-12至08-18.docx
+++ b/Google_Ads周报_2026-08-12至08-18.docx
@@ -917,7 +917,13 @@
           <w:color w:val="6B7280"/>
           <w:sz w:val="17"/>
         </w:rPr>
-        <w:t>图2｜本周变更记录：素材资源组、预算及否定关键词调整</w:t>
+      </w:r>
+      <w:r>
+        <w:rPr>
+          <w:rFonts w:ascii="Arial" w:hAnsi="Arial" w:eastAsia="Microsoft YaHei"/>
+          <w:sz w:val="17"/>
+        </w:rPr>
+        <w:t>图2｜Roller &amp; Honeycomb广告系列：素材资源组状态及表现</w:t>
       </w:r>
     </w:p>
     <w:p>
@@ -1062,7 +1068,13 @@
           <w:color w:val="6B7280"/>
           <w:sz w:val="17"/>
         </w:rPr>
-        <w:t>图3｜本周变更记录：PMax素材、产品范围及Search出价策略调整</w:t>
+      </w:r>
+      <w:r>
+        <w:rPr>
+          <w:rFonts w:ascii="Arial" w:hAnsi="Arial" w:eastAsia="Microsoft YaHei"/>
+          <w:sz w:val="17"/>
+        </w:rPr>
+        <w:t>图3｜小样与秋冬Promotion广告系列：素材资源组状态及表现</w:t>
       </w:r>
     </w:p>
     <w:p>
@@ -1207,7 +1219,13 @@
           <w:color w:val="6B7280"/>
           <w:sz w:val="17"/>
         </w:rPr>
-        <w:t>图4｜本周变更记录：Search预算与出价、产品过滤条件及Promotion预算调整</w:t>
+      </w:r>
+      <w:r>
+        <w:rPr>
+          <w:rFonts w:ascii="Arial" w:hAnsi="Arial" w:eastAsia="Microsoft YaHei"/>
+          <w:sz w:val="17"/>
+        </w:rPr>
+        <w:t>图4｜Demand Gen-feed广告系列：广告素材及本周表现</w:t>
       </w:r>
     </w:p>
     <w:p>

</xml_diff>

<commit_message>
Add detailed campaign-level performance analysis
Co-authored-by: Sylviaaa555 <Sylviaaa555@users.noreply.github.com>
</commit_message>
<xml_diff>
--- a/Google_Ads周报_2026-08-12至08-18.docx
+++ b/Google_Ads周报_2026-08-12至08-18.docx
@@ -1403,6 +1403,1474 @@
     </w:p>
     <w:p>
       <w:pPr>
+        <w:keepNext/>
+        <w:pageBreakBefore/>
+        <w:spacing w:after="140"/>
+        <w:pBdr>
+          <w:bottom w:val="single" w:sz="10" w:space="3" w:color="E67E22"/>
+        </w:pBdr>
+      </w:pPr>
+      <w:r>
+        <w:rPr>
+          <w:rFonts w:ascii="Arial" w:hAnsi="Arial" w:eastAsia="Microsoft YaHei"/>
+          <w:b/>
+          <w:color w:val="233142"/>
+          <w:sz w:val="30"/>
+        </w:rPr>
+        <w:t>广告系列逐项数据分析</w:t>
+      </w:r>
+    </w:p>
+    <w:p>
+      <w:pPr>
+        <w:spacing w:after="120" w:line="300" w:lineRule="auto"/>
+      </w:pPr>
+      <w:r>
+        <w:rPr>
+          <w:rFonts w:ascii="Arial" w:hAnsi="Arial" w:eastAsia="Microsoft YaHei"/>
+          <w:b w:val="0"/>
+          <w:color w:val="6B7280"/>
+          <w:sz w:val="18"/>
+        </w:rPr>
+        <w:t>以下数据均为2026年8月12–18日，对比8月5–11日。Google Ads采用数据驱动归因时可能出现小数转化，因此保留平台原始精度。</w:t>
+      </w:r>
+    </w:p>
+    <w:tbl>
+      <w:tblPr>
+        <w:tblStyle w:val="TableGrid"/>
+        <w:tblW w:type="auto" w:w="0"/>
+        <w:jc w:val="center"/>
+        <w:tblLayout w:type="autofit"/>
+        <w:tblLook w:firstColumn="1" w:firstRow="1" w:lastColumn="0" w:lastRow="0" w:noHBand="0" w:noVBand="1" w:val="04A0"/>
+      </w:tblPr>
+      <w:tblGrid>
+        <w:gridCol w:w="1728"/>
+        <w:gridCol w:w="1728"/>
+        <w:gridCol w:w="1728"/>
+        <w:gridCol w:w="1728"/>
+        <w:gridCol w:w="1728"/>
+        <w:gridCol w:w="1728"/>
+      </w:tblGrid>
+      <w:tr>
+        <w:tc>
+          <w:tcPr>
+            <w:tcW w:type="dxa" w:w="1728"/>
+            <w:shd w:fill="233142"/>
+            <w:vAlign w:val="center"/>
+          </w:tcPr>
+          <w:p>
+            <w:pPr>
+              <w:spacing w:after="0"/>
+              <w:jc w:val="center"/>
+            </w:pPr>
+            <w:r/>
+            <w:r>
+              <w:rPr>
+                <w:rFonts w:ascii="Arial" w:hAnsi="Arial" w:eastAsia="Microsoft YaHei"/>
+                <w:b/>
+                <w:color w:val="FFFFFF"/>
+                <w:sz w:val="16"/>
+              </w:rPr>
+              <w:t>广告系列</w:t>
+            </w:r>
+          </w:p>
+        </w:tc>
+        <w:tc>
+          <w:tcPr>
+            <w:tcW w:type="dxa" w:w="1728"/>
+            <w:shd w:fill="233142"/>
+            <w:vAlign w:val="center"/>
+          </w:tcPr>
+          <w:p>
+            <w:pPr>
+              <w:spacing w:after="0"/>
+              <w:jc w:val="center"/>
+            </w:pPr>
+            <w:r/>
+            <w:r>
+              <w:rPr>
+                <w:rFonts w:ascii="Arial" w:hAnsi="Arial" w:eastAsia="Microsoft YaHei"/>
+                <w:b/>
+                <w:color w:val="FFFFFF"/>
+                <w:sz w:val="16"/>
+              </w:rPr>
+              <w:t>花费(US$)</w:t>
+            </w:r>
+          </w:p>
+        </w:tc>
+        <w:tc>
+          <w:tcPr>
+            <w:tcW w:type="dxa" w:w="1728"/>
+            <w:shd w:fill="233142"/>
+            <w:vAlign w:val="center"/>
+          </w:tcPr>
+          <w:p>
+            <w:pPr>
+              <w:spacing w:after="0"/>
+              <w:jc w:val="center"/>
+            </w:pPr>
+            <w:r/>
+            <w:r>
+              <w:rPr>
+                <w:rFonts w:ascii="Arial" w:hAnsi="Arial" w:eastAsia="Microsoft YaHei"/>
+                <w:b/>
+                <w:color w:val="FFFFFF"/>
+                <w:sz w:val="16"/>
+              </w:rPr>
+              <w:t>转化</w:t>
+            </w:r>
+          </w:p>
+        </w:tc>
+        <w:tc>
+          <w:tcPr>
+            <w:tcW w:type="dxa" w:w="1728"/>
+            <w:shd w:fill="233142"/>
+            <w:vAlign w:val="center"/>
+          </w:tcPr>
+          <w:p>
+            <w:pPr>
+              <w:spacing w:after="0"/>
+              <w:jc w:val="center"/>
+            </w:pPr>
+            <w:r/>
+            <w:r>
+              <w:rPr>
+                <w:rFonts w:ascii="Arial" w:hAnsi="Arial" w:eastAsia="Microsoft YaHei"/>
+                <w:b/>
+                <w:color w:val="FFFFFF"/>
+                <w:sz w:val="16"/>
+              </w:rPr>
+              <w:t>转化价值</w:t>
+            </w:r>
+          </w:p>
+        </w:tc>
+        <w:tc>
+          <w:tcPr>
+            <w:tcW w:type="dxa" w:w="1728"/>
+            <w:shd w:fill="233142"/>
+            <w:vAlign w:val="center"/>
+          </w:tcPr>
+          <w:p>
+            <w:pPr>
+              <w:spacing w:after="0"/>
+              <w:jc w:val="center"/>
+            </w:pPr>
+            <w:r/>
+            <w:r>
+              <w:rPr>
+                <w:rFonts w:ascii="Arial" w:hAnsi="Arial" w:eastAsia="Microsoft YaHei"/>
+                <w:b/>
+                <w:color w:val="FFFFFF"/>
+                <w:sz w:val="16"/>
+              </w:rPr>
+              <w:t>ROAS</w:t>
+            </w:r>
+          </w:p>
+        </w:tc>
+        <w:tc>
+          <w:tcPr>
+            <w:tcW w:type="dxa" w:w="1728"/>
+            <w:shd w:fill="233142"/>
+            <w:vAlign w:val="center"/>
+          </w:tcPr>
+          <w:p>
+            <w:pPr>
+              <w:spacing w:after="0"/>
+              <w:jc w:val="center"/>
+            </w:pPr>
+            <w:r/>
+            <w:r>
+              <w:rPr>
+                <w:rFonts w:ascii="Arial" w:hAnsi="Arial" w:eastAsia="Microsoft YaHei"/>
+                <w:b/>
+                <w:color w:val="FFFFFF"/>
+                <w:sz w:val="16"/>
+              </w:rPr>
+              <w:t>判断</w:t>
+            </w:r>
+          </w:p>
+        </w:tc>
+      </w:tr>
+      <w:tr>
+        <w:tc>
+          <w:tcPr>
+            <w:tcW w:type="dxa" w:w="1728"/>
+            <w:vAlign w:val="center"/>
+          </w:tcPr>
+          <w:p>
+            <w:pPr>
+              <w:spacing w:after="0"/>
+              <w:jc w:val="left"/>
+            </w:pPr>
+            <w:r/>
+            <w:r>
+              <w:rPr>
+                <w:rFonts w:ascii="Arial" w:hAnsi="Arial" w:eastAsia="Microsoft YaHei"/>
+                <w:b/>
+                <w:color w:val="233142"/>
+                <w:sz w:val="16"/>
+              </w:rPr>
+              <w:t>Roller &amp; Honeycomb</w:t>
+            </w:r>
+          </w:p>
+        </w:tc>
+        <w:tc>
+          <w:tcPr>
+            <w:tcW w:type="dxa" w:w="1728"/>
+            <w:vAlign w:val="center"/>
+          </w:tcPr>
+          <w:p>
+            <w:pPr>
+              <w:spacing w:after="0"/>
+              <w:jc w:val="center"/>
+            </w:pPr>
+            <w:r/>
+            <w:r>
+              <w:rPr>
+                <w:rFonts w:ascii="Arial" w:hAnsi="Arial" w:eastAsia="Microsoft YaHei"/>
+                <w:b w:val="0"/>
+                <w:color w:val="233142"/>
+                <w:sz w:val="16"/>
+              </w:rPr>
+              <w:t>173.43</w:t>
+            </w:r>
+          </w:p>
+        </w:tc>
+        <w:tc>
+          <w:tcPr>
+            <w:tcW w:type="dxa" w:w="1728"/>
+            <w:vAlign w:val="center"/>
+          </w:tcPr>
+          <w:p>
+            <w:pPr>
+              <w:spacing w:after="0"/>
+              <w:jc w:val="center"/>
+            </w:pPr>
+            <w:r/>
+            <w:r>
+              <w:rPr>
+                <w:rFonts w:ascii="Arial" w:hAnsi="Arial" w:eastAsia="Microsoft YaHei"/>
+                <w:b w:val="0"/>
+                <w:color w:val="233142"/>
+                <w:sz w:val="16"/>
+              </w:rPr>
+              <w:t>2.85</w:t>
+            </w:r>
+          </w:p>
+        </w:tc>
+        <w:tc>
+          <w:tcPr>
+            <w:tcW w:type="dxa" w:w="1728"/>
+            <w:vAlign w:val="center"/>
+          </w:tcPr>
+          <w:p>
+            <w:pPr>
+              <w:spacing w:after="0"/>
+              <w:jc w:val="center"/>
+            </w:pPr>
+            <w:r/>
+            <w:r>
+              <w:rPr>
+                <w:rFonts w:ascii="Arial" w:hAnsi="Arial" w:eastAsia="Microsoft YaHei"/>
+                <w:b w:val="0"/>
+                <w:color w:val="233142"/>
+                <w:sz w:val="16"/>
+              </w:rPr>
+              <w:t>1,454.84</w:t>
+            </w:r>
+          </w:p>
+        </w:tc>
+        <w:tc>
+          <w:tcPr>
+            <w:tcW w:type="dxa" w:w="1728"/>
+            <w:vAlign w:val="center"/>
+          </w:tcPr>
+          <w:p>
+            <w:pPr>
+              <w:spacing w:after="0"/>
+              <w:jc w:val="center"/>
+            </w:pPr>
+            <w:r/>
+            <w:r>
+              <w:rPr>
+                <w:rFonts w:ascii="Arial" w:hAnsi="Arial" w:eastAsia="Microsoft YaHei"/>
+                <w:b/>
+                <w:color w:val="233142"/>
+                <w:sz w:val="16"/>
+              </w:rPr>
+              <w:t>8.39</w:t>
+            </w:r>
+          </w:p>
+        </w:tc>
+        <w:tc>
+          <w:tcPr>
+            <w:tcW w:type="dxa" w:w="1728"/>
+            <w:vAlign w:val="center"/>
+            <w:shd w:fill="EAF7EF"/>
+          </w:tcPr>
+          <w:p>
+            <w:pPr>
+              <w:spacing w:after="0"/>
+              <w:jc w:val="left"/>
+            </w:pPr>
+            <w:r>
+              <w:rPr>
+                <w:color w:val="1E8449"/>
+              </w:rPr>
+            </w:r>
+            <w:r>
+              <w:rPr>
+                <w:rFonts w:ascii="Arial" w:hAnsi="Arial" w:eastAsia="Microsoft YaHei"/>
+                <w:b w:val="0"/>
+                <w:color w:val="233142"/>
+                <w:sz w:val="16"/>
+              </w:rPr>
+              <w:t>价值主力，可控量</w:t>
+            </w:r>
+          </w:p>
+        </w:tc>
+      </w:tr>
+      <w:tr>
+        <w:tc>
+          <w:tcPr>
+            <w:tcW w:type="dxa" w:w="1728"/>
+            <w:vAlign w:val="center"/>
+          </w:tcPr>
+          <w:p>
+            <w:pPr>
+              <w:spacing w:after="0"/>
+              <w:jc w:val="left"/>
+            </w:pPr>
+            <w:r/>
+            <w:r>
+              <w:rPr>
+                <w:rFonts w:ascii="Arial" w:hAnsi="Arial" w:eastAsia="Microsoft YaHei"/>
+                <w:b/>
+                <w:color w:val="233142"/>
+                <w:sz w:val="16"/>
+              </w:rPr>
+              <w:t>小样</w:t>
+            </w:r>
+          </w:p>
+        </w:tc>
+        <w:tc>
+          <w:tcPr>
+            <w:tcW w:type="dxa" w:w="1728"/>
+            <w:vAlign w:val="center"/>
+          </w:tcPr>
+          <w:p>
+            <w:pPr>
+              <w:spacing w:after="0"/>
+              <w:jc w:val="center"/>
+            </w:pPr>
+            <w:r/>
+            <w:r>
+              <w:rPr>
+                <w:rFonts w:ascii="Arial" w:hAnsi="Arial" w:eastAsia="Microsoft YaHei"/>
+                <w:b w:val="0"/>
+                <w:color w:val="233142"/>
+                <w:sz w:val="16"/>
+              </w:rPr>
+              <w:t>93.25</w:t>
+            </w:r>
+          </w:p>
+        </w:tc>
+        <w:tc>
+          <w:tcPr>
+            <w:tcW w:type="dxa" w:w="1728"/>
+            <w:vAlign w:val="center"/>
+          </w:tcPr>
+          <w:p>
+            <w:pPr>
+              <w:spacing w:after="0"/>
+              <w:jc w:val="center"/>
+            </w:pPr>
+            <w:r/>
+            <w:r>
+              <w:rPr>
+                <w:rFonts w:ascii="Arial" w:hAnsi="Arial" w:eastAsia="Microsoft YaHei"/>
+                <w:b w:val="0"/>
+                <w:color w:val="233142"/>
+                <w:sz w:val="16"/>
+              </w:rPr>
+              <w:t>1.00</w:t>
+            </w:r>
+          </w:p>
+        </w:tc>
+        <w:tc>
+          <w:tcPr>
+            <w:tcW w:type="dxa" w:w="1728"/>
+            <w:vAlign w:val="center"/>
+          </w:tcPr>
+          <w:p>
+            <w:pPr>
+              <w:spacing w:after="0"/>
+              <w:jc w:val="center"/>
+            </w:pPr>
+            <w:r/>
+            <w:r>
+              <w:rPr>
+                <w:rFonts w:ascii="Arial" w:hAnsi="Arial" w:eastAsia="Microsoft YaHei"/>
+                <w:b w:val="0"/>
+                <w:color w:val="233142"/>
+                <w:sz w:val="16"/>
+              </w:rPr>
+              <w:t>479.93</w:t>
+            </w:r>
+          </w:p>
+        </w:tc>
+        <w:tc>
+          <w:tcPr>
+            <w:tcW w:type="dxa" w:w="1728"/>
+            <w:vAlign w:val="center"/>
+          </w:tcPr>
+          <w:p>
+            <w:pPr>
+              <w:spacing w:after="0"/>
+              <w:jc w:val="center"/>
+            </w:pPr>
+            <w:r/>
+            <w:r>
+              <w:rPr>
+                <w:rFonts w:ascii="Arial" w:hAnsi="Arial" w:eastAsia="Microsoft YaHei"/>
+                <w:b/>
+                <w:color w:val="233142"/>
+                <w:sz w:val="16"/>
+              </w:rPr>
+              <w:t>5.15</w:t>
+            </w:r>
+          </w:p>
+        </w:tc>
+        <w:tc>
+          <w:tcPr>
+            <w:tcW w:type="dxa" w:w="1728"/>
+            <w:vAlign w:val="center"/>
+            <w:shd w:fill="EAF7EF"/>
+          </w:tcPr>
+          <w:p>
+            <w:pPr>
+              <w:spacing w:after="0"/>
+              <w:jc w:val="left"/>
+            </w:pPr>
+            <w:r>
+              <w:rPr>
+                <w:color w:val="1E8449"/>
+              </w:rPr>
+            </w:r>
+            <w:r>
+              <w:rPr>
+                <w:rFonts w:ascii="Arial" w:hAnsi="Arial" w:eastAsia="Microsoft YaHei"/>
+                <w:b w:val="0"/>
+                <w:color w:val="233142"/>
+                <w:sz w:val="16"/>
+              </w:rPr>
+              <w:t>价值提升，需验证</w:t>
+            </w:r>
+          </w:p>
+        </w:tc>
+      </w:tr>
+      <w:tr>
+        <w:tc>
+          <w:tcPr>
+            <w:tcW w:type="dxa" w:w="1728"/>
+            <w:vAlign w:val="center"/>
+          </w:tcPr>
+          <w:p>
+            <w:pPr>
+              <w:spacing w:after="0"/>
+              <w:jc w:val="left"/>
+            </w:pPr>
+            <w:r/>
+            <w:r>
+              <w:rPr>
+                <w:rFonts w:ascii="Arial" w:hAnsi="Arial" w:eastAsia="Microsoft YaHei"/>
+                <w:b/>
+                <w:color w:val="233142"/>
+                <w:sz w:val="16"/>
+              </w:rPr>
+              <w:t>4月Promotion</w:t>
+            </w:r>
+          </w:p>
+        </w:tc>
+        <w:tc>
+          <w:tcPr>
+            <w:tcW w:type="dxa" w:w="1728"/>
+            <w:vAlign w:val="center"/>
+          </w:tcPr>
+          <w:p>
+            <w:pPr>
+              <w:spacing w:after="0"/>
+              <w:jc w:val="center"/>
+            </w:pPr>
+            <w:r/>
+            <w:r>
+              <w:rPr>
+                <w:rFonts w:ascii="Arial" w:hAnsi="Arial" w:eastAsia="Microsoft YaHei"/>
+                <w:b w:val="0"/>
+                <w:color w:val="233142"/>
+                <w:sz w:val="16"/>
+              </w:rPr>
+              <w:t>39.78</w:t>
+            </w:r>
+          </w:p>
+        </w:tc>
+        <w:tc>
+          <w:tcPr>
+            <w:tcW w:type="dxa" w:w="1728"/>
+            <w:vAlign w:val="center"/>
+          </w:tcPr>
+          <w:p>
+            <w:pPr>
+              <w:spacing w:after="0"/>
+              <w:jc w:val="center"/>
+            </w:pPr>
+            <w:r/>
+            <w:r>
+              <w:rPr>
+                <w:rFonts w:ascii="Arial" w:hAnsi="Arial" w:eastAsia="Microsoft YaHei"/>
+                <w:b w:val="0"/>
+                <w:color w:val="233142"/>
+                <w:sz w:val="16"/>
+              </w:rPr>
+              <w:t>2.02</w:t>
+            </w:r>
+          </w:p>
+        </w:tc>
+        <w:tc>
+          <w:tcPr>
+            <w:tcW w:type="dxa" w:w="1728"/>
+            <w:vAlign w:val="center"/>
+          </w:tcPr>
+          <w:p>
+            <w:pPr>
+              <w:spacing w:after="0"/>
+              <w:jc w:val="center"/>
+            </w:pPr>
+            <w:r/>
+            <w:r>
+              <w:rPr>
+                <w:rFonts w:ascii="Arial" w:hAnsi="Arial" w:eastAsia="Microsoft YaHei"/>
+                <w:b w:val="0"/>
+                <w:color w:val="233142"/>
+                <w:sz w:val="16"/>
+              </w:rPr>
+              <w:t>460.20</w:t>
+            </w:r>
+          </w:p>
+        </w:tc>
+        <w:tc>
+          <w:tcPr>
+            <w:tcW w:type="dxa" w:w="1728"/>
+            <w:vAlign w:val="center"/>
+          </w:tcPr>
+          <w:p>
+            <w:pPr>
+              <w:spacing w:after="0"/>
+              <w:jc w:val="center"/>
+            </w:pPr>
+            <w:r/>
+            <w:r>
+              <w:rPr>
+                <w:rFonts w:ascii="Arial" w:hAnsi="Arial" w:eastAsia="Microsoft YaHei"/>
+                <w:b/>
+                <w:color w:val="233142"/>
+                <w:sz w:val="16"/>
+              </w:rPr>
+              <w:t>11.57</w:t>
+            </w:r>
+          </w:p>
+        </w:tc>
+        <w:tc>
+          <w:tcPr>
+            <w:tcW w:type="dxa" w:w="1728"/>
+            <w:vAlign w:val="center"/>
+            <w:shd w:fill="EAF7EF"/>
+          </w:tcPr>
+          <w:p>
+            <w:pPr>
+              <w:spacing w:after="0"/>
+              <w:jc w:val="left"/>
+            </w:pPr>
+            <w:r>
+              <w:rPr>
+                <w:color w:val="1E8449"/>
+              </w:rPr>
+            </w:r>
+            <w:r>
+              <w:rPr>
+                <w:rFonts w:ascii="Arial" w:hAnsi="Arial" w:eastAsia="Microsoft YaHei"/>
+                <w:b w:val="0"/>
+                <w:color w:val="233142"/>
+                <w:sz w:val="16"/>
+              </w:rPr>
+              <w:t>效率最高，可测试放量</w:t>
+            </w:r>
+          </w:p>
+        </w:tc>
+      </w:tr>
+      <w:tr>
+        <w:tc>
+          <w:tcPr>
+            <w:tcW w:type="dxa" w:w="1728"/>
+            <w:vAlign w:val="center"/>
+          </w:tcPr>
+          <w:p>
+            <w:pPr>
+              <w:spacing w:after="0"/>
+              <w:jc w:val="left"/>
+            </w:pPr>
+            <w:r/>
+            <w:r>
+              <w:rPr>
+                <w:rFonts w:ascii="Arial" w:hAnsi="Arial" w:eastAsia="Microsoft YaHei"/>
+                <w:b/>
+                <w:color w:val="233142"/>
+                <w:sz w:val="16"/>
+              </w:rPr>
+              <w:t>Demand Gen-feed</w:t>
+            </w:r>
+          </w:p>
+        </w:tc>
+        <w:tc>
+          <w:tcPr>
+            <w:tcW w:type="dxa" w:w="1728"/>
+            <w:vAlign w:val="center"/>
+          </w:tcPr>
+          <w:p>
+            <w:pPr>
+              <w:spacing w:after="0"/>
+              <w:jc w:val="center"/>
+            </w:pPr>
+            <w:r/>
+            <w:r>
+              <w:rPr>
+                <w:rFonts w:ascii="Arial" w:hAnsi="Arial" w:eastAsia="Microsoft YaHei"/>
+                <w:b w:val="0"/>
+                <w:color w:val="233142"/>
+                <w:sz w:val="16"/>
+              </w:rPr>
+              <w:t>66.43</w:t>
+            </w:r>
+          </w:p>
+        </w:tc>
+        <w:tc>
+          <w:tcPr>
+            <w:tcW w:type="dxa" w:w="1728"/>
+            <w:vAlign w:val="center"/>
+          </w:tcPr>
+          <w:p>
+            <w:pPr>
+              <w:spacing w:after="0"/>
+              <w:jc w:val="center"/>
+            </w:pPr>
+            <w:r/>
+            <w:r>
+              <w:rPr>
+                <w:rFonts w:ascii="Arial" w:hAnsi="Arial" w:eastAsia="Microsoft YaHei"/>
+                <w:b w:val="0"/>
+                <w:color w:val="233142"/>
+                <w:sz w:val="16"/>
+              </w:rPr>
+              <w:t>1.32</w:t>
+            </w:r>
+          </w:p>
+        </w:tc>
+        <w:tc>
+          <w:tcPr>
+            <w:tcW w:type="dxa" w:w="1728"/>
+            <w:vAlign w:val="center"/>
+          </w:tcPr>
+          <w:p>
+            <w:pPr>
+              <w:spacing w:after="0"/>
+              <w:jc w:val="center"/>
+            </w:pPr>
+            <w:r/>
+            <w:r>
+              <w:rPr>
+                <w:rFonts w:ascii="Arial" w:hAnsi="Arial" w:eastAsia="Microsoft YaHei"/>
+                <w:b w:val="0"/>
+                <w:color w:val="233142"/>
+                <w:sz w:val="16"/>
+              </w:rPr>
+              <w:t>410.77</w:t>
+            </w:r>
+          </w:p>
+        </w:tc>
+        <w:tc>
+          <w:tcPr>
+            <w:tcW w:type="dxa" w:w="1728"/>
+            <w:vAlign w:val="center"/>
+          </w:tcPr>
+          <w:p>
+            <w:pPr>
+              <w:spacing w:after="0"/>
+              <w:jc w:val="center"/>
+            </w:pPr>
+            <w:r/>
+            <w:r>
+              <w:rPr>
+                <w:rFonts w:ascii="Arial" w:hAnsi="Arial" w:eastAsia="Microsoft YaHei"/>
+                <w:b/>
+                <w:color w:val="233142"/>
+                <w:sz w:val="16"/>
+              </w:rPr>
+              <w:t>6.18</w:t>
+            </w:r>
+          </w:p>
+        </w:tc>
+        <w:tc>
+          <w:tcPr>
+            <w:tcW w:type="dxa" w:w="1728"/>
+            <w:vAlign w:val="center"/>
+            <w:shd w:fill="EAF7EF"/>
+          </w:tcPr>
+          <w:p>
+            <w:pPr>
+              <w:spacing w:after="0"/>
+              <w:jc w:val="left"/>
+            </w:pPr>
+            <w:r>
+              <w:rPr>
+                <w:color w:val="1E8449"/>
+              </w:rPr>
+            </w:r>
+            <w:r>
+              <w:rPr>
+                <w:rFonts w:ascii="Arial" w:hAnsi="Arial" w:eastAsia="Microsoft YaHei"/>
+                <w:b w:val="0"/>
+                <w:color w:val="233142"/>
+                <w:sz w:val="16"/>
+              </w:rPr>
+              <w:t>素材有效，继续观察</w:t>
+            </w:r>
+          </w:p>
+        </w:tc>
+      </w:tr>
+      <w:tr>
+        <w:tc>
+          <w:tcPr>
+            <w:tcW w:type="dxa" w:w="1728"/>
+            <w:vAlign w:val="center"/>
+          </w:tcPr>
+          <w:p>
+            <w:pPr>
+              <w:spacing w:after="0"/>
+              <w:jc w:val="left"/>
+            </w:pPr>
+            <w:r/>
+            <w:r>
+              <w:rPr>
+                <w:rFonts w:ascii="Arial" w:hAnsi="Arial" w:eastAsia="Microsoft YaHei"/>
+                <w:b/>
+                <w:color w:val="233142"/>
+                <w:sz w:val="16"/>
+              </w:rPr>
+              <w:t>秋冬Promotion</w:t>
+            </w:r>
+          </w:p>
+        </w:tc>
+        <w:tc>
+          <w:tcPr>
+            <w:tcW w:type="dxa" w:w="1728"/>
+            <w:vAlign w:val="center"/>
+          </w:tcPr>
+          <w:p>
+            <w:pPr>
+              <w:spacing w:after="0"/>
+              <w:jc w:val="center"/>
+            </w:pPr>
+            <w:r/>
+            <w:r>
+              <w:rPr>
+                <w:rFonts w:ascii="Arial" w:hAnsi="Arial" w:eastAsia="Microsoft YaHei"/>
+                <w:b w:val="0"/>
+                <w:color w:val="233142"/>
+                <w:sz w:val="16"/>
+              </w:rPr>
+              <w:t>67.31</w:t>
+            </w:r>
+          </w:p>
+        </w:tc>
+        <w:tc>
+          <w:tcPr>
+            <w:tcW w:type="dxa" w:w="1728"/>
+            <w:vAlign w:val="center"/>
+          </w:tcPr>
+          <w:p>
+            <w:pPr>
+              <w:spacing w:after="0"/>
+              <w:jc w:val="center"/>
+            </w:pPr>
+            <w:r/>
+            <w:r>
+              <w:rPr>
+                <w:rFonts w:ascii="Arial" w:hAnsi="Arial" w:eastAsia="Microsoft YaHei"/>
+                <w:b w:val="0"/>
+                <w:color w:val="233142"/>
+                <w:sz w:val="16"/>
+              </w:rPr>
+              <w:t>0.02</w:t>
+            </w:r>
+          </w:p>
+        </w:tc>
+        <w:tc>
+          <w:tcPr>
+            <w:tcW w:type="dxa" w:w="1728"/>
+            <w:vAlign w:val="center"/>
+          </w:tcPr>
+          <w:p>
+            <w:pPr>
+              <w:spacing w:after="0"/>
+              <w:jc w:val="center"/>
+            </w:pPr>
+            <w:r/>
+            <w:r>
+              <w:rPr>
+                <w:rFonts w:ascii="Arial" w:hAnsi="Arial" w:eastAsia="Microsoft YaHei"/>
+                <w:b w:val="0"/>
+                <w:color w:val="233142"/>
+                <w:sz w:val="16"/>
+              </w:rPr>
+              <w:t>33.01</w:t>
+            </w:r>
+          </w:p>
+        </w:tc>
+        <w:tc>
+          <w:tcPr>
+            <w:tcW w:type="dxa" w:w="1728"/>
+            <w:vAlign w:val="center"/>
+          </w:tcPr>
+          <w:p>
+            <w:pPr>
+              <w:spacing w:after="0"/>
+              <w:jc w:val="center"/>
+            </w:pPr>
+            <w:r/>
+            <w:r>
+              <w:rPr>
+                <w:rFonts w:ascii="Arial" w:hAnsi="Arial" w:eastAsia="Microsoft YaHei"/>
+                <w:b/>
+                <w:color w:val="233142"/>
+                <w:sz w:val="16"/>
+              </w:rPr>
+              <w:t>0.49</w:t>
+            </w:r>
+          </w:p>
+        </w:tc>
+        <w:tc>
+          <w:tcPr>
+            <w:tcW w:type="dxa" w:w="1728"/>
+            <w:vAlign w:val="center"/>
+            <w:shd w:fill="FDEDEC"/>
+          </w:tcPr>
+          <w:p>
+            <w:pPr>
+              <w:spacing w:after="0"/>
+              <w:jc w:val="left"/>
+            </w:pPr>
+            <w:r>
+              <w:rPr>
+                <w:color w:val="C0392B"/>
+              </w:rPr>
+            </w:r>
+            <w:r>
+              <w:rPr>
+                <w:rFonts w:ascii="Arial" w:hAnsi="Arial" w:eastAsia="Microsoft YaHei"/>
+                <w:b w:val="0"/>
+                <w:color w:val="233142"/>
+                <w:sz w:val="16"/>
+              </w:rPr>
+              <w:t>显著下滑，保持控费</w:t>
+            </w:r>
+          </w:p>
+        </w:tc>
+      </w:tr>
+      <w:tr>
+        <w:tc>
+          <w:tcPr>
+            <w:tcW w:type="dxa" w:w="1728"/>
+            <w:vAlign w:val="center"/>
+          </w:tcPr>
+          <w:p>
+            <w:pPr>
+              <w:spacing w:after="0"/>
+              <w:jc w:val="left"/>
+            </w:pPr>
+            <w:r/>
+            <w:r>
+              <w:rPr>
+                <w:rFonts w:ascii="Arial" w:hAnsi="Arial" w:eastAsia="Microsoft YaHei"/>
+                <w:b/>
+                <w:color w:val="233142"/>
+                <w:sz w:val="16"/>
+              </w:rPr>
+              <w:t>Search-Brand</w:t>
+            </w:r>
+          </w:p>
+        </w:tc>
+        <w:tc>
+          <w:tcPr>
+            <w:tcW w:type="dxa" w:w="1728"/>
+            <w:vAlign w:val="center"/>
+          </w:tcPr>
+          <w:p>
+            <w:pPr>
+              <w:spacing w:after="0"/>
+              <w:jc w:val="center"/>
+            </w:pPr>
+            <w:r/>
+            <w:r>
+              <w:rPr>
+                <w:rFonts w:ascii="Arial" w:hAnsi="Arial" w:eastAsia="Microsoft YaHei"/>
+                <w:b w:val="0"/>
+                <w:color w:val="233142"/>
+                <w:sz w:val="16"/>
+              </w:rPr>
+              <w:t>4.74</w:t>
+            </w:r>
+          </w:p>
+        </w:tc>
+        <w:tc>
+          <w:tcPr>
+            <w:tcW w:type="dxa" w:w="1728"/>
+            <w:vAlign w:val="center"/>
+          </w:tcPr>
+          <w:p>
+            <w:pPr>
+              <w:spacing w:after="0"/>
+              <w:jc w:val="center"/>
+            </w:pPr>
+            <w:r/>
+            <w:r>
+              <w:rPr>
+                <w:rFonts w:ascii="Arial" w:hAnsi="Arial" w:eastAsia="Microsoft YaHei"/>
+                <w:b w:val="0"/>
+                <w:color w:val="233142"/>
+                <w:sz w:val="16"/>
+              </w:rPr>
+              <w:t>0.00</w:t>
+            </w:r>
+          </w:p>
+        </w:tc>
+        <w:tc>
+          <w:tcPr>
+            <w:tcW w:type="dxa" w:w="1728"/>
+            <w:vAlign w:val="center"/>
+          </w:tcPr>
+          <w:p>
+            <w:pPr>
+              <w:spacing w:after="0"/>
+              <w:jc w:val="center"/>
+            </w:pPr>
+            <w:r/>
+            <w:r>
+              <w:rPr>
+                <w:rFonts w:ascii="Arial" w:hAnsi="Arial" w:eastAsia="Microsoft YaHei"/>
+                <w:b w:val="0"/>
+                <w:color w:val="233142"/>
+                <w:sz w:val="16"/>
+              </w:rPr>
+              <w:t>0.00</w:t>
+            </w:r>
+          </w:p>
+        </w:tc>
+        <w:tc>
+          <w:tcPr>
+            <w:tcW w:type="dxa" w:w="1728"/>
+            <w:vAlign w:val="center"/>
+          </w:tcPr>
+          <w:p>
+            <w:pPr>
+              <w:spacing w:after="0"/>
+              <w:jc w:val="center"/>
+            </w:pPr>
+            <w:r/>
+            <w:r>
+              <w:rPr>
+                <w:rFonts w:ascii="Arial" w:hAnsi="Arial" w:eastAsia="Microsoft YaHei"/>
+                <w:b/>
+                <w:color w:val="233142"/>
+                <w:sz w:val="16"/>
+              </w:rPr>
+              <w:t>0.00</w:t>
+            </w:r>
+          </w:p>
+        </w:tc>
+        <w:tc>
+          <w:tcPr>
+            <w:tcW w:type="dxa" w:w="1728"/>
+            <w:vAlign w:val="center"/>
+            <w:shd w:fill="FDEDEC"/>
+          </w:tcPr>
+          <w:p>
+            <w:pPr>
+              <w:spacing w:after="0"/>
+              <w:jc w:val="left"/>
+            </w:pPr>
+            <w:r>
+              <w:rPr>
+                <w:color w:val="C0392B"/>
+              </w:rPr>
+            </w:r>
+            <w:r>
+              <w:rPr>
+                <w:rFonts w:ascii="Arial" w:hAnsi="Arial" w:eastAsia="Microsoft YaHei"/>
+                <w:b w:val="0"/>
+                <w:color w:val="233142"/>
+                <w:sz w:val="16"/>
+              </w:rPr>
+              <w:t>高CTR无转化，需排查</w:t>
+            </w:r>
+          </w:p>
+        </w:tc>
+      </w:tr>
+      <w:tr>
+        <w:tc>
+          <w:tcPr>
+            <w:tcW w:type="dxa" w:w="1728"/>
+            <w:vAlign w:val="center"/>
+          </w:tcPr>
+          <w:p>
+            <w:pPr>
+              <w:spacing w:after="0"/>
+              <w:jc w:val="left"/>
+            </w:pPr>
+            <w:r/>
+            <w:r>
+              <w:rPr>
+                <w:rFonts w:ascii="Arial" w:hAnsi="Arial" w:eastAsia="Microsoft YaHei"/>
+                <w:b/>
+                <w:color w:val="233142"/>
+                <w:sz w:val="16"/>
+              </w:rPr>
+              <w:t>DG-Winter</w:t>
+            </w:r>
+          </w:p>
+        </w:tc>
+        <w:tc>
+          <w:tcPr>
+            <w:tcW w:type="dxa" w:w="1728"/>
+            <w:vAlign w:val="center"/>
+          </w:tcPr>
+          <w:p>
+            <w:pPr>
+              <w:spacing w:after="0"/>
+              <w:jc w:val="center"/>
+            </w:pPr>
+            <w:r/>
+            <w:r>
+              <w:rPr>
+                <w:rFonts w:ascii="Arial" w:hAnsi="Arial" w:eastAsia="Microsoft YaHei"/>
+                <w:b w:val="0"/>
+                <w:color w:val="233142"/>
+                <w:sz w:val="16"/>
+              </w:rPr>
+              <w:t>9.42</w:t>
+            </w:r>
+          </w:p>
+        </w:tc>
+        <w:tc>
+          <w:tcPr>
+            <w:tcW w:type="dxa" w:w="1728"/>
+            <w:vAlign w:val="center"/>
+          </w:tcPr>
+          <w:p>
+            <w:pPr>
+              <w:spacing w:after="0"/>
+              <w:jc w:val="center"/>
+            </w:pPr>
+            <w:r/>
+            <w:r>
+              <w:rPr>
+                <w:rFonts w:ascii="Arial" w:hAnsi="Arial" w:eastAsia="Microsoft YaHei"/>
+                <w:b w:val="0"/>
+                <w:color w:val="233142"/>
+                <w:sz w:val="16"/>
+              </w:rPr>
+              <w:t>0.00</w:t>
+            </w:r>
+          </w:p>
+        </w:tc>
+        <w:tc>
+          <w:tcPr>
+            <w:tcW w:type="dxa" w:w="1728"/>
+            <w:vAlign w:val="center"/>
+          </w:tcPr>
+          <w:p>
+            <w:pPr>
+              <w:spacing w:after="0"/>
+              <w:jc w:val="center"/>
+            </w:pPr>
+            <w:r/>
+            <w:r>
+              <w:rPr>
+                <w:rFonts w:ascii="Arial" w:hAnsi="Arial" w:eastAsia="Microsoft YaHei"/>
+                <w:b w:val="0"/>
+                <w:color w:val="233142"/>
+                <w:sz w:val="16"/>
+              </w:rPr>
+              <w:t>0.00</w:t>
+            </w:r>
+          </w:p>
+        </w:tc>
+        <w:tc>
+          <w:tcPr>
+            <w:tcW w:type="dxa" w:w="1728"/>
+            <w:vAlign w:val="center"/>
+          </w:tcPr>
+          <w:p>
+            <w:pPr>
+              <w:spacing w:after="0"/>
+              <w:jc w:val="center"/>
+            </w:pPr>
+            <w:r/>
+            <w:r>
+              <w:rPr>
+                <w:rFonts w:ascii="Arial" w:hAnsi="Arial" w:eastAsia="Microsoft YaHei"/>
+                <w:b/>
+                <w:color w:val="233142"/>
+                <w:sz w:val="16"/>
+              </w:rPr>
+              <w:t>0.00</w:t>
+            </w:r>
+          </w:p>
+        </w:tc>
+        <w:tc>
+          <w:tcPr>
+            <w:tcW w:type="dxa" w:w="1728"/>
+            <w:vAlign w:val="center"/>
+            <w:shd w:fill="FDEDEC"/>
+          </w:tcPr>
+          <w:p>
+            <w:pPr>
+              <w:spacing w:after="0"/>
+              <w:jc w:val="left"/>
+            </w:pPr>
+            <w:r>
+              <w:rPr>
+                <w:color w:val="C0392B"/>
+              </w:rPr>
+            </w:r>
+            <w:r>
+              <w:rPr>
+                <w:rFonts w:ascii="Arial" w:hAnsi="Arial" w:eastAsia="Microsoft YaHei"/>
+                <w:b w:val="0"/>
+                <w:color w:val="233142"/>
+                <w:sz w:val="16"/>
+              </w:rPr>
+              <w:t>流量增但无转化</w:t>
+            </w:r>
+          </w:p>
+        </w:tc>
+      </w:tr>
+    </w:tbl>
+    <w:p>
+      <w:pPr>
+        <w:keepNext/>
+        <w:spacing w:before="120" w:after="40"/>
+      </w:pPr>
+      <w:r>
+        <w:rPr>
+          <w:rFonts w:ascii="Arial" w:hAnsi="Arial" w:eastAsia="Microsoft YaHei"/>
+          <w:b/>
+          <w:color w:val="E67E22"/>
+          <w:sz w:val="21"/>
+        </w:rPr>
+        <w:t xml:space="preserve">1. Sales-Performance Max-Roller &amp; Honeycomb  </w:t>
+      </w:r>
+      <w:r>
+        <w:rPr>
+          <w:rFonts w:ascii="Arial" w:hAnsi="Arial" w:eastAsia="Microsoft YaHei"/>
+          <w:b/>
+          <w:color w:val="1E8449"/>
+          <w:sz w:val="19"/>
+        </w:rPr>
+        <w:t>【核心增长】</w:t>
+      </w:r>
+    </w:p>
+    <w:p>
+      <w:pPr>
+        <w:spacing w:after="100" w:line="300" w:lineRule="auto"/>
+        <w:ind w:firstLine="400"/>
+      </w:pPr>
+      <w:r>
+        <w:rPr>
+          <w:rFonts w:ascii="Arial" w:hAnsi="Arial" w:eastAsia="Microsoft YaHei"/>
+          <w:b w:val="0"/>
+          <w:color w:val="233142"/>
+          <w:sz w:val="19"/>
+        </w:rPr>
+        <w:t>本周花费US$173.43，较上周US$147.96增长17.22%；展示量增长65.08%，点击增长89.47%，平均CPC由US$0.97降至US$0.60。转化由1.00增至2.85，转化价值由US$329.96提升至US$1,454.84，ROAS由2.23提升至8.39，CPA由US$147.96降至US$60.83。该系列贡献本周51.25%的转化价值，是当前核心价值来源；建议保留高效素材组并小幅、分阶段测试放量。</w:t>
+      </w:r>
+    </w:p>
+    <w:p>
+      <w:pPr>
+        <w:keepNext/>
+        <w:spacing w:before="120" w:after="40"/>
+      </w:pPr>
+      <w:r>
+        <w:rPr>
+          <w:rFonts w:ascii="Arial" w:hAnsi="Arial" w:eastAsia="Microsoft YaHei"/>
+          <w:b/>
+          <w:color w:val="E67E22"/>
+          <w:sz w:val="21"/>
+        </w:rPr>
+        <w:t xml:space="preserve">2. Sales-Performance Max-小样  </w:t>
+      </w:r>
+      <w:r>
+        <w:rPr>
+          <w:rFonts w:ascii="Arial" w:hAnsi="Arial" w:eastAsia="Microsoft YaHei"/>
+          <w:b/>
+          <w:color w:val="E67E22"/>
+          <w:sz w:val="19"/>
+        </w:rPr>
+        <w:t>【继续验证】</w:t>
+      </w:r>
+    </w:p>
+    <w:p>
+      <w:pPr>
+        <w:spacing w:after="100" w:line="300" w:lineRule="auto"/>
+        <w:ind w:firstLine="400"/>
+      </w:pPr>
+      <w:r>
+        <w:rPr>
+          <w:rFonts w:ascii="Arial" w:hAnsi="Arial" w:eastAsia="Microsoft YaHei"/>
+          <w:b w:val="0"/>
+          <w:color w:val="233142"/>
+          <w:sz w:val="19"/>
+        </w:rPr>
+        <w:t>本周花费US$93.25，环比下降5.98%；展示增长47.60%，点击增长11.54%，但CTR由1.48%降至1.12%。转化维持1次，转化价值由US$9.95跃升至US$479.93，ROAS由0.10升至5.15，CPA降至US$93.25。价值提升主要来自单次高价值转化，样本仍小，不能仅凭一周数据大幅放量；建议继续验证新增素材能否稳定带来高价值订单。</w:t>
+      </w:r>
+    </w:p>
+    <w:p>
+      <w:pPr>
+        <w:keepNext/>
+        <w:spacing w:before="120" w:after="40"/>
+      </w:pPr>
+      <w:r>
+        <w:rPr>
+          <w:rFonts w:ascii="Arial" w:hAnsi="Arial" w:eastAsia="Microsoft YaHei"/>
+          <w:b/>
+          <w:color w:val="E67E22"/>
+          <w:sz w:val="21"/>
+        </w:rPr>
+        <w:t xml:space="preserve">3. Sales-Performance Max-4月Promotion  </w:t>
+      </w:r>
+      <w:r>
+        <w:rPr>
+          <w:rFonts w:ascii="Arial" w:hAnsi="Arial" w:eastAsia="Microsoft YaHei"/>
+          <w:b/>
+          <w:color w:val="1E8449"/>
+          <w:sz w:val="19"/>
+        </w:rPr>
+        <w:t>【可测试放量】</w:t>
+      </w:r>
+    </w:p>
+    <w:p>
+      <w:pPr>
+        <w:spacing w:after="100" w:line="300" w:lineRule="auto"/>
+        <w:ind w:firstLine="400"/>
+      </w:pPr>
+      <w:r>
+        <w:rPr>
+          <w:rFonts w:ascii="Arial" w:hAnsi="Arial" w:eastAsia="Microsoft YaHei"/>
+          <w:b w:val="0"/>
+          <w:color w:val="233142"/>
+          <w:sz w:val="19"/>
+        </w:rPr>
+        <w:t>本周花费US$39.78，环比下降44.68%；展示下降58.68%、点击下降30.77%，但CTR由1.03%升至1.73%，平均CPC由US$1.11降至US$0.88。转化由0增至2.02，转化价值由0增至US$460.20，ROAS达到11.57，为本周所有系列最高，CPA为US$19.70。流量缩减但质量显著改善，可在保持目标ROAS的前提下谨慎增加预算，验证放量后效率。</w:t>
+      </w:r>
+    </w:p>
+    <w:p>
+      <w:pPr>
+        <w:keepNext/>
+        <w:spacing w:before="120" w:after="40"/>
+      </w:pPr>
+      <w:r>
+        <w:rPr>
+          <w:rFonts w:ascii="Arial" w:hAnsi="Arial" w:eastAsia="Microsoft YaHei"/>
+          <w:b/>
+          <w:color w:val="E67E22"/>
+          <w:sz w:val="21"/>
+        </w:rPr>
+        <w:t xml:space="preserve">4. Demand Gen-feed  </w:t>
+      </w:r>
+      <w:r>
+        <w:rPr>
+          <w:rFonts w:ascii="Arial" w:hAnsi="Arial" w:eastAsia="Microsoft YaHei"/>
+          <w:b/>
+          <w:color w:val="1E8449"/>
+          <w:sz w:val="19"/>
+        </w:rPr>
+        <w:t>【素材有效】</w:t>
+      </w:r>
+    </w:p>
+    <w:p>
+      <w:pPr>
+        <w:spacing w:after="100" w:line="300" w:lineRule="auto"/>
+        <w:ind w:firstLine="400"/>
+      </w:pPr>
+      <w:r>
+        <w:rPr>
+          <w:rFonts w:ascii="Arial" w:hAnsi="Arial" w:eastAsia="Microsoft YaHei"/>
+          <w:b w:val="0"/>
+          <w:color w:val="233142"/>
+          <w:sz w:val="19"/>
+        </w:rPr>
+        <w:t>本周花费US$66.43，环比下降6.82%；展示增长82.82%，点击增长161.04%，CTR由2.18%提升至3.11%，平均CPC由US$0.93降至US$0.33。转化由0增至1.32，转化价值达到US$410.77，ROAS为6.18，CPA为US$50.38。新增视频与促销素材已带来流量和价值改善，建议继续观察转化质量，并按素材拆分保留高效创意。</w:t>
+      </w:r>
+    </w:p>
+    <w:p>
+      <w:pPr>
+        <w:keepNext/>
+        <w:spacing w:before="120" w:after="40"/>
+      </w:pPr>
+      <w:r>
+        <w:rPr>
+          <w:rFonts w:ascii="Arial" w:hAnsi="Arial" w:eastAsia="Microsoft YaHei"/>
+          <w:b/>
+          <w:color w:val="E67E22"/>
+          <w:sz w:val="21"/>
+        </w:rPr>
+        <w:t xml:space="preserve">5. Sales-Performance Max-秋冬Promotion  </w:t>
+      </w:r>
+      <w:r>
+        <w:rPr>
+          <w:rFonts w:ascii="Arial" w:hAnsi="Arial" w:eastAsia="Microsoft YaHei"/>
+          <w:b/>
+          <w:color w:val="C0392B"/>
+          <w:sz w:val="19"/>
+        </w:rPr>
+        <w:t>【重点控费】</w:t>
+      </w:r>
+    </w:p>
+    <w:p>
+      <w:pPr>
+        <w:spacing w:after="100" w:line="300" w:lineRule="auto"/>
+        <w:ind w:firstLine="400"/>
+      </w:pPr>
+      <w:r>
+        <w:rPr>
+          <w:rFonts w:ascii="Arial" w:hAnsi="Arial" w:eastAsia="Microsoft YaHei"/>
+          <w:b w:val="0"/>
+          <w:color w:val="233142"/>
+          <w:sz w:val="19"/>
+        </w:rPr>
+        <w:t>本周花费US$67.31，环比下降46.79%；展示下降31.64%，点击下降34.75%，CTR由1.11%降至1.06%。转化由1.00降至0.02，转化价值由US$304.97降至US$33.01，ROAS由2.41降至0.49，CPA升至US$3,469.63。预算、目标ROAS和产品范围同时调整后表现显著下滑，建议保持控费，优先检查剩余产品组、素材相关性及转化路径，不建议立即恢复预算。</w:t>
+      </w:r>
+    </w:p>
+    <w:p>
+      <w:pPr>
+        <w:keepNext/>
+        <w:spacing w:before="120" w:after="40"/>
+      </w:pPr>
+      <w:r>
+        <w:rPr>
+          <w:rFonts w:ascii="Arial" w:hAnsi="Arial" w:eastAsia="Microsoft YaHei"/>
+          <w:b/>
+          <w:color w:val="E67E22"/>
+          <w:sz w:val="21"/>
+        </w:rPr>
+        <w:t xml:space="preserve">6. Sales-Search-Brand BM  </w:t>
+      </w:r>
+      <w:r>
+        <w:rPr>
+          <w:rFonts w:ascii="Arial" w:hAnsi="Arial" w:eastAsia="Microsoft YaHei"/>
+          <w:b/>
+          <w:color w:val="C0392B"/>
+          <w:sz w:val="19"/>
+        </w:rPr>
+        <w:t>【排查转化】</w:t>
+      </w:r>
+    </w:p>
+    <w:p>
+      <w:pPr>
+        <w:spacing w:after="100" w:line="300" w:lineRule="auto"/>
+        <w:ind w:firstLine="400"/>
+      </w:pPr>
+      <w:r>
+        <w:rPr>
+          <w:rFonts w:ascii="Arial" w:hAnsi="Arial" w:eastAsia="Microsoft YaHei"/>
+          <w:b w:val="0"/>
+          <w:color w:val="233142"/>
+          <w:sz w:val="19"/>
+        </w:rPr>
+        <w:t>本周花费US$4.74，环比下降75.59%；展示下降16.00%，点击下降18.75%，CTR仍保持30.95%的高位，平均CPC由US$1.21降至US$0.36。但转化由1降至0，转化价值由US$71.13降至0，ROAS由3.66降至0。说明品牌词点击意愿仍强，但本周没有形成订单；建议排查出价策略切换后的流量覆盖、品牌词搜索意图和落地页转化链路。</w:t>
+      </w:r>
+    </w:p>
+    <w:p>
+      <w:pPr>
+        <w:keepNext/>
+        <w:spacing w:before="120" w:after="40"/>
+      </w:pPr>
+      <w:r>
+        <w:rPr>
+          <w:rFonts w:ascii="Arial" w:hAnsi="Arial" w:eastAsia="Microsoft YaHei"/>
+          <w:b/>
+          <w:color w:val="E67E22"/>
+          <w:sz w:val="21"/>
+        </w:rPr>
+        <w:t xml:space="preserve">7. Demand Gen-Winter Promotion  </w:t>
+      </w:r>
+      <w:r>
+        <w:rPr>
+          <w:rFonts w:ascii="Arial" w:hAnsi="Arial" w:eastAsia="Microsoft YaHei"/>
+          <w:b/>
+          <w:color w:val="C0392B"/>
+          <w:sz w:val="19"/>
+        </w:rPr>
+        <w:t>【暂不扩量】</w:t>
+      </w:r>
+    </w:p>
+    <w:p>
+      <w:pPr>
+        <w:spacing w:after="100" w:line="300" w:lineRule="auto"/>
+        <w:ind w:firstLine="400"/>
+      </w:pPr>
+      <w:r>
+        <w:rPr>
+          <w:rFonts w:ascii="Arial" w:hAnsi="Arial" w:eastAsia="Microsoft YaHei"/>
+          <w:b w:val="0"/>
+          <w:color w:val="233142"/>
+          <w:sz w:val="19"/>
+        </w:rPr>
+        <w:t>本周花费US$9.42，环比增长114.38%；展示增长115.27%，点击增长37.04%，但CTR由2.14%降至1.36%，平均CPC由US$0.16升至US$0.25，连续两周均无转化。当前流量增长未转化为业务价值，建议维持US$10日预算上限，继续测试创意和受众；在产生有效转化前不建议扩量。</w:t>
+      </w:r>
+    </w:p>
+    <w:tbl>
+      <w:tblPr>
+        <w:tblW w:type="auto" w:w="0"/>
+        <w:jc w:val="center"/>
+        <w:tblLook w:firstColumn="1" w:firstRow="1" w:lastColumn="0" w:lastRow="0" w:noHBand="0" w:noVBand="1" w:val="04A0"/>
+      </w:tblPr>
+      <w:tblGrid>
+        <w:gridCol w:w="10368"/>
+      </w:tblGrid>
+      <w:tr>
+        <w:tc>
+          <w:tcPr>
+            <w:tcW w:type="dxa" w:w="10368"/>
+            <w:shd w:fill="FFF8F2"/>
+          </w:tcPr>
+          <w:p>
+            <w:pPr>
+              <w:spacing w:before="120" w:after="120"/>
+            </w:pPr>
+            <w:r>
+              <w:rPr>
+                <w:rFonts w:ascii="Arial" w:hAnsi="Arial" w:eastAsia="Microsoft YaHei"/>
+                <w:b/>
+                <w:color w:val="E67E22"/>
+                <w:sz w:val="20"/>
+              </w:rPr>
+              <w:t>预算建议：优先保障Roller &amp; Honeycomb、4月Promotion及Demand Gen-feed；小样系列继续验证高价值转化稳定性；秋冬Promotion、Search及DG-Winter保持控费并优先修复转化。</w:t>
+            </w:r>
+          </w:p>
+        </w:tc>
+      </w:tr>
+    </w:tbl>
+    <w:p>
+      <w:pPr>
         <w:spacing w:before="200" w:after="140"/>
         <w:pBdr>
           <w:bottom w:val="single" w:sz="14" w:space="4" w:color="E67E22"/>

</xml_diff>